<commit_message>
Enhance NOC template with family suffix and stay line placeholders
- Updated `noc-travel.docx` to include a `{{family_suffix}}` placeholder after the companion passport number and a new paragraph for `{{stay_line}}` after the Visa Type section.
- Modified `document_mapping.json` to add mappings for the new placeholders.
- Introduced a script (`patch_noc_family_and_stay.py`) to automate the updates to the NOC template, ensuring idempotent execution for safe re-runs.
</commit_message>
<xml_diff>
--- a/Documents Generation/noc-travel.docx
+++ b/Documents Generation/noc-travel.docx
@@ -131,7 +131,7 @@
         </w:rPr>
       </w:pPr>
       <w:r>
-        <w:t>We, Maids CC Domestic Workers Services LLC, hereby certify that we have no objection to {{maid_name}}, holding passport number {{maid_passport_number}}, Nationality {{maid_nationality}},holding ID card number {{maid_eid_number}}, currently employed under our sponsorship as a {{maid_profession}}, traveling to {{destination_country}} accompanied by {{companion_salutation_name}}. {{companion_name}}, {{companion_nationality}}, holding passport number {{companion_passport_number}}.</w:t>
+        <w:t>We, Maids CC Domestic Workers Services LLC, hereby certify that we have no objection to {{maid_name}}, holding passport number {{maid_passport_number}}, Nationality {{maid_nationality}},holding ID card number {{maid_eid_number}}, currently employed under our sponsorship as a {{maid_profession}}, traveling to {{destination_country}} accompanied by {{companion_salutation_name}}. {{companion_name}}, {{companion_nationality}}, holding passport number {{companion_passport_number}}{{family_suffix}}</w:t>
       </w:r>
       <w:r>
         <w:rPr>
@@ -234,6 +234,19 @@
           <w:bCs/>
         </w:rPr>
         <w:t>Visa Type: {{visa_type}}</w:t>
+      </w:r>
+    </w:p>
+    <w:p>
+      <w:pPr>
+        <w:spacing w:before="204"/>
+        <w:ind w:left="1"/>
+        <w:rPr>
+          <w:b/>
+          <w:bCs/>
+        </w:rPr>
+      </w:pPr>
+      <w:r>
+        <w:t>{{stay_line}}</w:t>
       </w:r>
     </w:p>
     <w:p>

</xml_diff>

<commit_message>
Enhance document generation for Turkey NOC and client NOC
- Added support for a new Turkey NOC template (`noc-turkey.docx`) and updated the document mapping to include relevant placeholders for the NOC.
- Implemented a new endpoint for generating the Turkey client NOC as a flat PDF, with appropriate error handling for missing templates and mappings.
- Updated `document_mapping.json` to include mappings for the new client NOC fields.
- Enhanced the existing NOC generation logic to accommodate the new document types, ensuring comprehensive support for Turkey-related applications.
</commit_message>
<xml_diff>
--- a/Documents Generation/noc-travel.docx
+++ b/Documents Generation/noc-travel.docx
@@ -36,6 +36,18 @@
           <w:szCs w:val="26"/>
         </w:rPr>
       </w:pPr>
+    </w:p>
+    <w:p>
+      <w:pPr>
+        <w:pStyle w:val="Title"/>
+        <w:ind w:firstLine="359"/>
+        <w:rPr>
+          <w:u w:val="none"/>
+        </w:rPr>
+      </w:pPr>
+      <w:r>
+        <w:t>{{addressee}}</w:t>
+      </w:r>
     </w:p>
     <w:p>
       <w:pPr>

</xml_diff>

<commit_message>
Add replace_signatory endpoint to redact names in PDFs and stamp with configured signatory
Introduced a new API endpoint `/replace-signatory` that allows users to redact hardcoded individual signatory names in existing PDFs and replace them with a configured signatory title (defaulting to "HR Manager"). The endpoint accepts a base64-encoded PDF and a list of names to redact, returning the modified PDF or a JSON envelope with the updated content.

Additionally, updated document templates to include fields for `signatory_name`, `signature_image_url`, and `stamp_image_url`, ensuring that the generated documents can incorporate dynamic signatory information. Enhanced the document generation logic to embed signature and stamp images around the signatory line when provided.

This commit also includes various updates to the document mapping and utility functions to support these new features, ensuring compliance with the updated requirements for document generation.
</commit_message>
<xml_diff>
--- a/Documents Generation/noc-travel.docx
+++ b/Documents Generation/noc-travel.docx
@@ -143,7 +143,7 @@
         </w:rPr>
       </w:pPr>
       <w:r>
-        <w:t>We, Maids CC Domestic Workers Services LLC, hereby certify that we have no objection to {{maid_name}}, holding passport number {{maid_passport_number}}, Nationality {{maid_nationality}},holding ID card number {{maid_eid_number}}, currently employed under our sponsorship as a {{maid_profession}}, traveling to {{destination_country}} accompanied by {{companion_salutation_name}}. {{companion_name}}, {{companion_nationality}}, holding passport number {{companion_passport_number}}{{family_suffix}}</w:t>
+        <w:t>We, Maids CC Domestic Workers Services LLC, hereby certify that we have no objection to {{maid_name}}, holding passport number {{maid_passport_number}}, Nationality {{maid_nationality}},holding ID card number {{maid_eid_number}}, currently employed under our sponsorship as a {{maid_profession}}, traveling to {{destination_country}} accompanied by {{companion_salutation_name}}. {{companion_name}}, {{companion_nationality}}, {{companion_gender}}, holding passport number {{companion_passport_number}}{{family_suffix}}</w:t>
       </w:r>
       <w:r>
         <w:rPr>
@@ -327,6 +327,12 @@
       </w:pPr>
     </w:p>
     <w:p>
+      <w:pPr/>
+      <w:r>
+        <w:t>{{signatory_name}}</w:t>
+      </w:r>
+    </w:p>
+    <w:p>
       <w:pPr>
         <w:spacing w:before="1"/>
         <w:ind w:left="1"/>
@@ -355,49 +361,6 @@
         <w:rPr>
           <w:noProof/>
         </w:rPr>
-        <w:drawing>
-          <wp:anchor distT="0" distB="0" distL="0" distR="0" simplePos="0" relativeHeight="251658240" behindDoc="0" locked="0" layoutInCell="1" hidden="0" allowOverlap="1" wp14:anchorId="2A81254B" wp14:editId="3780829E">
-            <wp:simplePos x="0" y="0"/>
-            <wp:positionH relativeFrom="column">
-              <wp:posOffset>0</wp:posOffset>
-            </wp:positionH>
-            <wp:positionV relativeFrom="paragraph">
-              <wp:posOffset>195567</wp:posOffset>
-            </wp:positionV>
-            <wp:extent cx="2190484" cy="955548"/>
-            <wp:effectExtent l="0" t="0" r="0" b="0"/>
-            <wp:wrapTopAndBottom distT="0" distB="0"/>
-            <wp:docPr id="2" name="image2.jpg"/>
-            <wp:cNvGraphicFramePr/>
-            <a:graphic xmlns:a="http://schemas.openxmlformats.org/drawingml/2006/main">
-              <a:graphicData uri="http://schemas.openxmlformats.org/drawingml/2006/picture">
-                <pic:pic xmlns:pic="http://schemas.openxmlformats.org/drawingml/2006/picture">
-                  <pic:nvPicPr>
-                    <pic:cNvPr id="0" name="image2.jpg"/>
-                    <pic:cNvPicPr preferRelativeResize="0"/>
-                  </pic:nvPicPr>
-                  <pic:blipFill>
-                    <a:blip r:embed="rId6"/>
-                    <a:srcRect/>
-                    <a:stretch>
-                      <a:fillRect/>
-                    </a:stretch>
-                  </pic:blipFill>
-                  <pic:spPr>
-                    <a:xfrm>
-                      <a:off x="0" y="0"/>
-                      <a:ext cx="2190484" cy="955548"/>
-                    </a:xfrm>
-                    <a:prstGeom prst="rect">
-                      <a:avLst/>
-                    </a:prstGeom>
-                    <a:ln/>
-                  </pic:spPr>
-                </pic:pic>
-              </a:graphicData>
-            </a:graphic>
-          </wp:anchor>
-        </w:drawing>
       </w:r>
     </w:p>
     <w:sectPr>

</xml_diff>